<commit_message>
Update will: beneficiary names, Fidelity TOD account, fixed 50% share for David
Co-Authored-By: Claude Fable 5.1 <noreply@anthropic.com>
Claude-Session: https://claude.ai/code/session_0167tGaXTeJNKviLoHzSqyQm
</commit_message>
<xml_diff>
--- a/Last_Will_and_Testament_Colin_Tenaglia.docx
+++ b/Last_Will_and_Testament_Colin_Tenaglia.docx
@@ -324,7 +324,7 @@
                 <w:sz w:val="24"/>
                 <w:szCs w:val="24"/>
               </w:rPr>
-              <w:t xml:space="preserve">Andrew ______________ [last name]</w:t>
+              <w:t xml:space="preserve">Andrew Tenaglia</w:t>
             </w:r>
           </w:p>
         </w:tc>
@@ -542,7 +542,7 @@
                 <w:sz w:val="24"/>
                 <w:szCs w:val="24"/>
               </w:rPr>
-              <w:t xml:space="preserve">______________ [relationship]</w:t>
+              <w:t xml:space="preserve">Significant other</w:t>
             </w:r>
           </w:p>
         </w:tc>
@@ -576,7 +576,7 @@
                 <w:sz w:val="24"/>
                 <w:szCs w:val="24"/>
               </w:rPr>
-              <w:t xml:space="preserve">Tamara ______________ [last name]</w:t>
+              <w:t xml:space="preserve">Tamara Gerek</w:t>
             </w:r>
           </w:p>
         </w:tc>
@@ -605,7 +605,7 @@
                 <w:sz w:val="24"/>
                 <w:szCs w:val="24"/>
               </w:rPr>
-              <w:t xml:space="preserve">______________ [relationship]</w:t>
+              <w:t xml:space="preserve">Friend</w:t>
             </w:r>
           </w:p>
         </w:tc>
@@ -646,7 +646,7 @@
           <w:sz w:val="26"/>
           <w:szCs w:val="26"/>
         </w:rPr>
-        <w:t xml:space="preserve">ARTICLE III – PAYMENT OF DEBTS, EXPENSES, AND TAXES</w:t>
+        <w:t xml:space="preserve">ARTICLE III – PAYMENT OF DEBTS, EXPENSES, AND TAXES; DEFINITIONS</w:t>
       </w:r>
     </w:p>
     <w:p>
@@ -657,10 +657,146 @@
       <w:r>
         <w:rPr>
           <w:rFonts w:ascii="Times New Roman" w:cs="Times New Roman" w:eastAsia="Times New Roman" w:hAnsi="Times New Roman"/>
-          <w:sz w:val="24"/>
-          <w:szCs w:val="24"/>
-        </w:rPr>
-        <w:t xml:space="preserve">I direct my Personal Representative to pay from my estate all of my legally enforceable debts, the expenses of my last illness and funeral, the costs of administering my estate, and any estate, inheritance, or similar taxes payable by reason of my death, before any distribution is made under Article IV. “Net Estate” as used in this Will means the value of all property I own at my death that passes under this Will, after payment of the foregoing items.</w:t>
+          <w:b/>
+          <w:bCs/>
+          <w:sz w:val="24"/>
+          <w:szCs w:val="24"/>
+        </w:rPr>
+        <w:t xml:space="preserve">3.1  </w:t>
+      </w:r>
+      <w:r>
+        <w:rPr>
+          <w:rFonts w:ascii="Times New Roman" w:cs="Times New Roman" w:eastAsia="Times New Roman" w:hAnsi="Times New Roman"/>
+          <w:sz w:val="24"/>
+          <w:szCs w:val="24"/>
+        </w:rPr>
+        <w:t xml:space="preserve">I direct my Personal Representative to pay from my estate all of my legally enforceable debts, the expenses of my last illness and funeral, the costs of administering my estate, and any estate, inheritance, or similar taxes payable by reason of my death, before any distribution is made under Article IV.</w:t>
+      </w:r>
+    </w:p>
+    <w:p>
+      <w:pPr>
+        <w:spacing w:after="200" w:line="300"/>
+        <w:jc w:val="both"/>
+      </w:pPr>
+      <w:r>
+        <w:rPr>
+          <w:rFonts w:ascii="Times New Roman" w:cs="Times New Roman" w:eastAsia="Times New Roman" w:hAnsi="Times New Roman"/>
+          <w:b/>
+          <w:bCs/>
+          <w:sz w:val="24"/>
+          <w:szCs w:val="24"/>
+        </w:rPr>
+        <w:t xml:space="preserve">3.2  </w:t>
+      </w:r>
+      <w:r>
+        <w:rPr>
+          <w:rFonts w:ascii="Times New Roman" w:cs="Times New Roman" w:eastAsia="Times New Roman" w:hAnsi="Times New Roman"/>
+          <w:sz w:val="24"/>
+          <w:szCs w:val="24"/>
+        </w:rPr>
+        <w:t xml:space="preserve">“</w:t>
+      </w:r>
+      <w:r>
+        <w:rPr>
+          <w:rFonts w:ascii="Times New Roman" w:cs="Times New Roman" w:eastAsia="Times New Roman" w:hAnsi="Times New Roman"/>
+          <w:b/>
+          <w:bCs/>
+          <w:sz w:val="24"/>
+          <w:szCs w:val="24"/>
+        </w:rPr>
+        <w:t xml:space="preserve">Net Estate</w:t>
+      </w:r>
+      <w:r>
+        <w:rPr>
+          <w:rFonts w:ascii="Times New Roman" w:cs="Times New Roman" w:eastAsia="Times New Roman" w:hAnsi="Times New Roman"/>
+          <w:sz w:val="24"/>
+          <w:szCs w:val="24"/>
+        </w:rPr>
+        <w:t xml:space="preserve">” means the value of all property I own at my death that passes under this Will, after payment of the items described in Section 3.1.</w:t>
+      </w:r>
+    </w:p>
+    <w:p>
+      <w:pPr>
+        <w:spacing w:after="200" w:line="300"/>
+        <w:jc w:val="both"/>
+      </w:pPr>
+      <w:r>
+        <w:rPr>
+          <w:rFonts w:ascii="Times New Roman" w:cs="Times New Roman" w:eastAsia="Times New Roman" w:hAnsi="Times New Roman"/>
+          <w:b/>
+          <w:bCs/>
+          <w:sz w:val="24"/>
+          <w:szCs w:val="24"/>
+        </w:rPr>
+        <w:t xml:space="preserve">3.3  </w:t>
+      </w:r>
+      <w:r>
+        <w:rPr>
+          <w:rFonts w:ascii="Times New Roman" w:cs="Times New Roman" w:eastAsia="Times New Roman" w:hAnsi="Times New Roman"/>
+          <w:sz w:val="24"/>
+          <w:szCs w:val="24"/>
+        </w:rPr>
+        <w:t xml:space="preserve">“</w:t>
+      </w:r>
+      <w:r>
+        <w:rPr>
+          <w:rFonts w:ascii="Times New Roman" w:cs="Times New Roman" w:eastAsia="Times New Roman" w:hAnsi="Times New Roman"/>
+          <w:b/>
+          <w:bCs/>
+          <w:sz w:val="24"/>
+          <w:szCs w:val="24"/>
+        </w:rPr>
+        <w:t xml:space="preserve">Fidelity Account</w:t>
+      </w:r>
+      <w:r>
+        <w:rPr>
+          <w:rFonts w:ascii="Times New Roman" w:cs="Times New Roman" w:eastAsia="Times New Roman" w:hAnsi="Times New Roman"/>
+          <w:sz w:val="24"/>
+          <w:szCs w:val="24"/>
+        </w:rPr>
+        <w:t xml:space="preserve">” means my individual (non-retirement) brokerage account maintained at Fidelity Investments, including all cash, securities, and other investments held in it, together with any successor or replacement account into which those assets are transferred. I acknowledge that the Fidelity Account currently carries a transfer-on-death (TOD) designation in favor of my brother, David Tenaglia, and that it will therefore pass to him outside of this Will.</w:t>
+      </w:r>
+    </w:p>
+    <w:p>
+      <w:pPr>
+        <w:spacing w:after="200" w:line="300"/>
+        <w:jc w:val="both"/>
+      </w:pPr>
+      <w:r>
+        <w:rPr>
+          <w:rFonts w:ascii="Times New Roman" w:cs="Times New Roman" w:eastAsia="Times New Roman" w:hAnsi="Times New Roman"/>
+          <w:b/>
+          <w:bCs/>
+          <w:sz w:val="24"/>
+          <w:szCs w:val="24"/>
+        </w:rPr>
+        <w:t xml:space="preserve">3.4  </w:t>
+      </w:r>
+      <w:r>
+        <w:rPr>
+          <w:rFonts w:ascii="Times New Roman" w:cs="Times New Roman" w:eastAsia="Times New Roman" w:hAnsi="Times New Roman"/>
+          <w:sz w:val="24"/>
+          <w:szCs w:val="24"/>
+        </w:rPr>
+        <w:t xml:space="preserve">“</w:t>
+      </w:r>
+      <w:r>
+        <w:rPr>
+          <w:rFonts w:ascii="Times New Roman" w:cs="Times New Roman" w:eastAsia="Times New Roman" w:hAnsi="Times New Roman"/>
+          <w:b/>
+          <w:bCs/>
+          <w:sz w:val="24"/>
+          <w:szCs w:val="24"/>
+        </w:rPr>
+        <w:t xml:space="preserve">Aggregate Estate</w:t>
+      </w:r>
+      <w:r>
+        <w:rPr>
+          <w:rFonts w:ascii="Times New Roman" w:cs="Times New Roman" w:eastAsia="Times New Roman" w:hAnsi="Times New Roman"/>
+          <w:sz w:val="24"/>
+          <w:szCs w:val="24"/>
+        </w:rPr>
+        <w:t xml:space="preserve">” means the sum of (a) my Net Estate and (b) the value, as of the date of my death, of the Fidelity Account and any other property that passes to David Tenaglia by reason of my death outside of this Will, including by beneficiary designation, transfer-on-death or payable-on-death registration, or right of survivorship.</w:t>
       </w:r>
     </w:p>
     <w:p>
@@ -697,7 +833,7 @@
           <w:sz w:val="24"/>
           <w:szCs w:val="24"/>
         </w:rPr>
-        <w:t xml:space="preserve">4.1  Gift to my brother, David Tenaglia</w:t>
+        <w:t xml:space="preserve">4.1  Share of my brother, David Tenaglia</w:t>
       </w:r>
     </w:p>
     <w:p>
@@ -711,7 +847,7 @@
           <w:sz w:val="24"/>
           <w:szCs w:val="24"/>
         </w:rPr>
-        <w:t xml:space="preserve">I give to my brother, </w:t>
+        <w:t xml:space="preserve">It is my intent that my brother, </w:t>
       </w:r>
       <w:r>
         <w:rPr>
@@ -729,117 +865,75 @@
           <w:sz w:val="24"/>
           <w:szCs w:val="24"/>
         </w:rPr>
-        <w:t xml:space="preserve">, if he survives me, </w:t>
-      </w:r>
-      <w:r>
-        <w:rPr>
-          <w:rFonts w:ascii="Times New Roman" w:cs="Times New Roman" w:eastAsia="Times New Roman" w:hAnsi="Times New Roman"/>
-          <w:b/>
-          <w:bCs/>
-          <w:sz w:val="24"/>
-          <w:szCs w:val="24"/>
-        </w:rPr>
-        <w:t xml:space="preserve">whichever of the following is greater in value</w:t>
-      </w:r>
-      <w:r>
-        <w:rPr>
-          <w:rFonts w:ascii="Times New Roman" w:cs="Times New Roman" w:eastAsia="Times New Roman" w:hAnsi="Times New Roman"/>
-          <w:sz w:val="24"/>
-          <w:szCs w:val="24"/>
-        </w:rPr>
-        <w:t xml:space="preserve"> as of the date of my death:</w:t>
+        <w:t xml:space="preserve">, receive a total of </w:t>
+      </w:r>
+      <w:r>
+        <w:rPr>
+          <w:rFonts w:ascii="Times New Roman" w:cs="Times New Roman" w:eastAsia="Times New Roman" w:hAnsi="Times New Roman"/>
+          <w:b/>
+          <w:bCs/>
+          <w:sz w:val="24"/>
+          <w:szCs w:val="24"/>
+        </w:rPr>
+        <w:t xml:space="preserve">fifty percent (50%)</w:t>
+      </w:r>
+      <w:r>
+        <w:rPr>
+          <w:rFonts w:ascii="Times New Roman" w:cs="Times New Roman" w:eastAsia="Times New Roman" w:hAnsi="Times New Roman"/>
+          <w:sz w:val="24"/>
+          <w:szCs w:val="24"/>
+        </w:rPr>
+        <w:t xml:space="preserve"> of my Aggregate Estate, and </w:t>
+      </w:r>
+      <w:r>
+        <w:rPr>
+          <w:rFonts w:ascii="Times New Roman" w:cs="Times New Roman" w:eastAsia="Times New Roman" w:hAnsi="Times New Roman"/>
+          <w:b/>
+          <w:bCs/>
+          <w:sz w:val="24"/>
+          <w:szCs w:val="24"/>
+        </w:rPr>
+        <w:t xml:space="preserve">no more and no less</w:t>
+      </w:r>
+      <w:r>
+        <w:rPr>
+          <w:rFonts w:ascii="Times New Roman" w:cs="Times New Roman" w:eastAsia="Times New Roman" w:hAnsi="Times New Roman"/>
+          <w:sz w:val="24"/>
+          <w:szCs w:val="24"/>
+        </w:rPr>
+        <w:t xml:space="preserve">, taking into account the Fidelity Account and any other property that passes to him outside of this Will.</w:t>
       </w:r>
     </w:p>
     <w:p>
       <w:pPr>
         <w:spacing w:after="200" w:line="300"/>
-        <w:ind w:left="720"/>
-        <w:jc w:val="both"/>
-      </w:pPr>
-      <w:r>
-        <w:rPr>
-          <w:rFonts w:ascii="Times New Roman" w:cs="Times New Roman" w:eastAsia="Times New Roman" w:hAnsi="Times New Roman"/>
-          <w:b/>
-          <w:bCs/>
-          <w:sz w:val="24"/>
-          <w:szCs w:val="24"/>
-        </w:rPr>
-        <w:t xml:space="preserve">(a)  </w:t>
-      </w:r>
-      <w:r>
-        <w:rPr>
-          <w:rFonts w:ascii="Times New Roman" w:cs="Times New Roman" w:eastAsia="Times New Roman" w:hAnsi="Times New Roman"/>
-          <w:sz w:val="24"/>
-          <w:szCs w:val="24"/>
-        </w:rPr>
-        <w:t xml:space="preserve">my individual (non-retirement) brokerage account, including all cash, securities, and other investments held in it, currently maintained at ______________________ [brokerage firm], account ending in ______ [last four digits], together with any successor or replacement account into which those assets are transferred; </w:t>
-      </w:r>
-      <w:r>
-        <w:rPr>
-          <w:rFonts w:ascii="Times New Roman" w:cs="Times New Roman" w:eastAsia="Times New Roman" w:hAnsi="Times New Roman"/>
-          <w:b/>
-          <w:bCs/>
-          <w:sz w:val="24"/>
-          <w:szCs w:val="24"/>
-        </w:rPr>
-        <w:t xml:space="preserve">or</w:t>
-      </w:r>
-    </w:p>
-    <w:p>
-      <w:pPr>
-        <w:spacing w:after="200" w:line="300"/>
-        <w:ind w:left="720"/>
-        <w:jc w:val="both"/>
-      </w:pPr>
-      <w:r>
-        <w:rPr>
-          <w:rFonts w:ascii="Times New Roman" w:cs="Times New Roman" w:eastAsia="Times New Roman" w:hAnsi="Times New Roman"/>
-          <w:b/>
-          <w:bCs/>
-          <w:sz w:val="24"/>
-          <w:szCs w:val="24"/>
-        </w:rPr>
-        <w:t xml:space="preserve">(b)  </w:t>
-      </w:r>
-      <w:r>
-        <w:rPr>
-          <w:rFonts w:ascii="Times New Roman" w:cs="Times New Roman" w:eastAsia="Times New Roman" w:hAnsi="Times New Roman"/>
-          <w:sz w:val="24"/>
-          <w:szCs w:val="24"/>
-        </w:rPr>
-        <w:t xml:space="preserve">an amount equal to </w:t>
-      </w:r>
-      <w:r>
-        <w:rPr>
-          <w:rFonts w:ascii="Times New Roman" w:cs="Times New Roman" w:eastAsia="Times New Roman" w:hAnsi="Times New Roman"/>
-          <w:b/>
-          <w:bCs/>
-          <w:sz w:val="24"/>
-          <w:szCs w:val="24"/>
-        </w:rPr>
-        <w:t xml:space="preserve">fifty percent (50%)</w:t>
-      </w:r>
-      <w:r>
-        <w:rPr>
-          <w:rFonts w:ascii="Times New Roman" w:cs="Times New Roman" w:eastAsia="Times New Roman" w:hAnsi="Times New Roman"/>
-          <w:sz w:val="24"/>
-          <w:szCs w:val="24"/>
-        </w:rPr>
-        <w:t xml:space="preserve"> of my Net Estate.</w:t>
-      </w:r>
-    </w:p>
-    <w:p>
-      <w:pPr>
-        <w:spacing w:after="200" w:line="300"/>
-        <w:jc w:val="both"/>
-      </w:pPr>
-      <w:r>
-        <w:rPr>
-          <w:rFonts w:ascii="Times New Roman" w:cs="Times New Roman" w:eastAsia="Times New Roman" w:hAnsi="Times New Roman"/>
-          <w:sz w:val="24"/>
-          <w:szCs w:val="24"/>
-        </w:rPr>
-        <w:t xml:space="preserve">If the value of the brokerage account described in (a) is greater than fifty percent (50%) of my Net Estate, David shall receive the brokerage account in kind, and it shall constitute his entire share under this Article. If fifty percent (50%) of my Net Estate is the greater amount, David shall receive the brokerage account in kind plus such additional cash or other property from my estate as is necessary to bring the total value of his share to fifty percent (50%) of my Net Estate.</w:t>
+        <w:jc w:val="both"/>
+      </w:pPr>
+      <w:r>
+        <w:rPr>
+          <w:rFonts w:ascii="Times New Roman" w:cs="Times New Roman" w:eastAsia="Times New Roman" w:hAnsi="Times New Roman"/>
+          <w:sz w:val="24"/>
+          <w:szCs w:val="24"/>
+        </w:rPr>
+        <w:t xml:space="preserve">Accordingly, if David survives me, I give him from my Net Estate an amount equal to (a) fifty percent (50%) of my Aggregate Estate, </w:t>
+      </w:r>
+      <w:r>
+        <w:rPr>
+          <w:rFonts w:ascii="Times New Roman" w:cs="Times New Roman" w:eastAsia="Times New Roman" w:hAnsi="Times New Roman"/>
+          <w:b/>
+          <w:bCs/>
+          <w:sz w:val="24"/>
+          <w:szCs w:val="24"/>
+        </w:rPr>
+        <w:t xml:space="preserve">minus</w:t>
+      </w:r>
+      <w:r>
+        <w:rPr>
+          <w:rFonts w:ascii="Times New Roman" w:cs="Times New Roman" w:eastAsia="Times New Roman" w:hAnsi="Times New Roman"/>
+          <w:sz w:val="24"/>
+          <w:szCs w:val="24"/>
+        </w:rPr>
+        <w:t xml:space="preserve"> (b) the value, as of the date of my death, of the Fidelity Account and any other property passing to him outside of this Will. If the amount so calculated is zero or less, David shall receive nothing under this Will, and the property passing to him outside of this Will shall constitute his entire share of my Aggregate Estate. Nothing in this Will shall be construed to require David to return or contribute any property that passes to him outside of this Will.</w:t>
       </w:r>
     </w:p>
     <w:p>
@@ -969,7 +1063,7 @@
                 <w:sz w:val="24"/>
                 <w:szCs w:val="24"/>
               </w:rPr>
-              <w:t xml:space="preserve">Share of total Net Estate (when David's share is exactly 50%)</w:t>
+              <w:t xml:space="preserve">Intended share of my Aggregate Estate</w:t>
             </w:r>
           </w:p>
         </w:tc>
@@ -1033,7 +1127,7 @@
                 <w:sz w:val="24"/>
                 <w:szCs w:val="24"/>
               </w:rPr>
-              <w:t xml:space="preserve">Andrew ______________, my uncle</w:t>
+              <w:t xml:space="preserve">Andrew Tenaglia, my uncle</w:t>
             </w:r>
           </w:p>
         </w:tc>
@@ -1309,7 +1403,7 @@
                 <w:sz w:val="24"/>
                 <w:szCs w:val="24"/>
               </w:rPr>
-              <w:t xml:space="preserve">Alina Nazarova</w:t>
+              <w:t xml:space="preserve">Alina Nazarova, my significant other</w:t>
             </w:r>
           </w:p>
         </w:tc>
@@ -1401,7 +1495,7 @@
                 <w:sz w:val="24"/>
                 <w:szCs w:val="24"/>
               </w:rPr>
-              <w:t xml:space="preserve">Tamara ______________</w:t>
+              <w:t xml:space="preserve">Tamara Gerek, my friend</w:t>
             </w:r>
           </w:p>
         </w:tc>
@@ -1499,7 +1593,7 @@
           <w:sz w:val="24"/>
           <w:szCs w:val="24"/>
         </w:rPr>
-        <w:t xml:space="preserve">. If David's share under Section 4.1 equals exactly fifty percent (50%) of my Net Estate, these gifts will equal the percentages of my total Net Estate shown in the second column. If David's share exceeds fifty percent (50%) because the brokerage account is the greater amount, the Remaining Estate shall be divided among these beneficiaries in the same relative proportions, as shown in the third column.</w:t>
+        <w:t xml:space="preserve">, so that, when combined with David's fifty percent (50%) share under Section 4.1, my Aggregate Estate is divided as shown in the second column. If the property passing to David outside of this Will exceeds fifty percent (50%) of my Aggregate Estate, the Remaining Estate shall nevertheless be divided among these five beneficiaries in the same relative proportions, as shown in the third column.</w:t>
       </w:r>
     </w:p>
     <w:p>
@@ -1595,7 +1689,7 @@
           <w:sz w:val="24"/>
           <w:szCs w:val="24"/>
         </w:rPr>
-        <w:t xml:space="preserve">I acknowledge that retirement accounts, life insurance, and accounts with beneficiary or transfer-on-death designations pass according to those designations and not under this Will. I intend to keep those designations consistent with the plan set out in this Will.</w:t>
+        <w:t xml:space="preserve">I acknowledge that retirement accounts, life insurance, and accounts with beneficiary or transfer-on-death designations pass according to those designations and not under this Will. Except as provided in Sections 3.4 and 4.1 with respect to property passing to David Tenaglia, such property shall not be taken into account in computing the shares under this Article.</w:t>
       </w:r>
     </w:p>
     <w:p>
@@ -1710,7 +1804,7 @@
           <w:sz w:val="24"/>
           <w:szCs w:val="24"/>
         </w:rPr>
-        <w:t xml:space="preserve">For purposes of Article IV, my Personal Representative's good-faith determination of the value of the brokerage account and of my Net Estate as of the date of my death shall be binding on all beneficiaries.</w:t>
+        <w:t xml:space="preserve">For purposes of Article IV, my Personal Representative's good-faith determination of the value of the Fidelity Account, of any other property passing to David Tenaglia outside of this Will, of my Net Estate, and of my Aggregate Estate as of the date of my death shall be binding on all beneficiaries.</w:t>
       </w:r>
     </w:p>
     <w:p>
@@ -2337,7 +2431,7 @@
           <w:sz w:val="24"/>
           <w:szCs w:val="24"/>
         </w:rPr>
-        <w:t xml:space="preserve">Fill in every blank: your city, county, and state; the last names of Andrew and Tamara and their relationship to you; Alina's relationship to you; the brokerage firm and last four digits of the account; and the name of your Personal Representative and an alternate.</w:t>
+        <w:t xml:space="preserve">Fill in every blank: your city, county, and state, and the name of your Personal Representative and an alternate. Account numbers are intentionally omitted; the Fidelity Account is identified by institution and ownership, which is sufficient.</w:t>
       </w:r>
     </w:p>
     <w:p>
@@ -2356,7 +2450,7 @@
           <w:sz w:val="24"/>
           <w:szCs w:val="24"/>
         </w:rPr>
-        <w:t xml:space="preserve">Confirm the brokerage account is an individual account with no transfer-on-death (TOD) beneficiary designation. A TOD designation would override Section 4.1, so either remove it or name David as the TOD beneficiary.</w:t>
+        <w:t xml:space="preserve">How David's 50% works: because the Fidelity Account is already TOD to David, it passes to him outside the will. Section 4.1 counts that account toward his 50% and tops him up from the probate estate only as needed. If the Fidelity Account alone is worth more than 50% of everything, a will cannot pull the excess back; David would keep the account and receive nothing further under the will. If you want a hard 50% cap in that scenario, the cleaner fix is to remove the TOD designation at Fidelity so the account passes under the will instead.</w:t>
       </w:r>
     </w:p>
     <w:p>
@@ -2375,7 +2469,7 @@
           <w:sz w:val="24"/>
           <w:szCs w:val="24"/>
         </w:rPr>
-        <w:t xml:space="preserve">Check your state's execution requirements. Most U.S. states require two adult witnesses who are not beneficiaries, and most accept a notarized self-proving affidavit to simplify probate.</w:t>
+        <w:t xml:space="preserve">Keep the TOD designation on the Fidelity Account limited to David. Adding other TOD beneficiaries, or TOD designations on other accounts, would change the math in Section 3.4.</w:t>
       </w:r>
     </w:p>
     <w:p>
@@ -2394,7 +2488,7 @@
           <w:sz w:val="24"/>
           <w:szCs w:val="24"/>
         </w:rPr>
-        <w:t xml:space="preserve">If you would prefer that Andrew, Anthony, Erin, Alina, and Tamara receive fixed percentages of the whole estate (10/10/10/15/5) regardless of the brokerage account's value, tell your attorney. Section 4.2 is currently drafted so their shares scale proportionally if the brokerage account exceeds half the estate.</w:t>
+        <w:t xml:space="preserve">Check your state's execution requirements. Most U.S. states require two adult witnesses who are not beneficiaries, and most accept a notarized self-proving affidavit to simplify probate.</w:t>
       </w:r>
     </w:p>
     <w:p>

</xml_diff>

<commit_message>
Update will: Brookfield WI residence and executor succession
Co-Authored-By: Claude Fable 5.1 <noreply@anthropic.com>
Claude-Session: https://claude.ai/code/session_0167tGaXTeJNKviLoHzSqyQm
</commit_message>
<xml_diff>
--- a/Last_Will_and_Testament_Colin_Tenaglia.docx
+++ b/Last_Will_and_Testament_Colin_Tenaglia.docx
@@ -82,7 +82,7 @@
           <w:sz w:val="24"/>
           <w:szCs w:val="24"/>
         </w:rPr>
-        <w:t xml:space="preserve">, a resident of ______________________ [City], ______________________ [County], ______________________ [State], being of sound mind and memory and not acting under duress, menace, fraud, or the undue influence of any person, do hereby make, publish, and declare this instrument to be my Last Will and Testament.</w:t>
+        <w:t xml:space="preserve">, a resident of the City of Brookfield, Waukesha County, State of Wisconsin, being of sound mind and memory and not acting under duress, menace, fraud, or the undue influence of any person, do hereby make, publish, and declare this instrument to be my Last Will and Testament.</w:t>
       </w:r>
     </w:p>
     <w:p>
@@ -1732,7 +1732,61 @@
           <w:sz w:val="24"/>
           <w:szCs w:val="24"/>
         </w:rPr>
-        <w:t xml:space="preserve">I nominate and appoint ______________________ [name] as Personal Representative (Executor) of my estate. If that person is unable or unwilling to serve, I nominate ______________________ [alternate name] to serve in that capacity.</w:t>
+        <w:t xml:space="preserve">I nominate and appoint my father, </w:t>
+      </w:r>
+      <w:r>
+        <w:rPr>
+          <w:rFonts w:ascii="Times New Roman" w:cs="Times New Roman" w:eastAsia="Times New Roman" w:hAnsi="Times New Roman"/>
+          <w:b/>
+          <w:bCs/>
+          <w:sz w:val="24"/>
+          <w:szCs w:val="24"/>
+        </w:rPr>
+        <w:t xml:space="preserve">ANTHONY ("TONY") TENAGLIA</w:t>
+      </w:r>
+      <w:r>
+        <w:rPr>
+          <w:rFonts w:ascii="Times New Roman" w:cs="Times New Roman" w:eastAsia="Times New Roman" w:hAnsi="Times New Roman"/>
+          <w:sz w:val="24"/>
+          <w:szCs w:val="24"/>
+        </w:rPr>
+        <w:t xml:space="preserve">, as Personal Representative (Executor) of my estate. If he is deceased, or is otherwise unable or unwilling to serve or to continue serving, I nominate my uncle, </w:t>
+      </w:r>
+      <w:r>
+        <w:rPr>
+          <w:rFonts w:ascii="Times New Roman" w:cs="Times New Roman" w:eastAsia="Times New Roman" w:hAnsi="Times New Roman"/>
+          <w:b/>
+          <w:bCs/>
+          <w:sz w:val="24"/>
+          <w:szCs w:val="24"/>
+        </w:rPr>
+        <w:t xml:space="preserve">ANDREW TENAGLIA</w:t>
+      </w:r>
+      <w:r>
+        <w:rPr>
+          <w:rFonts w:ascii="Times New Roman" w:cs="Times New Roman" w:eastAsia="Times New Roman" w:hAnsi="Times New Roman"/>
+          <w:sz w:val="24"/>
+          <w:szCs w:val="24"/>
+        </w:rPr>
+        <w:t xml:space="preserve">, as successor Personal Representative. If Andrew Tenaglia is also deceased, or is otherwise unable or unwilling to serve or to continue serving, I nominate my brother, </w:t>
+      </w:r>
+      <w:r>
+        <w:rPr>
+          <w:rFonts w:ascii="Times New Roman" w:cs="Times New Roman" w:eastAsia="Times New Roman" w:hAnsi="Times New Roman"/>
+          <w:b/>
+          <w:bCs/>
+          <w:sz w:val="24"/>
+          <w:szCs w:val="24"/>
+        </w:rPr>
+        <w:t xml:space="preserve">DAVID TENAGLIA</w:t>
+      </w:r>
+      <w:r>
+        <w:rPr>
+          <w:rFonts w:ascii="Times New Roman" w:cs="Times New Roman" w:eastAsia="Times New Roman" w:hAnsi="Times New Roman"/>
+          <w:sz w:val="24"/>
+          <w:szCs w:val="24"/>
+        </w:rPr>
+        <w:t xml:space="preserve">, as successor Personal Representative.</w:t>
       </w:r>
     </w:p>
     <w:p>
@@ -1780,7 +1834,7 @@
           <w:sz w:val="24"/>
           <w:szCs w:val="24"/>
         </w:rPr>
-        <w:t xml:space="preserve">My Personal Representative shall have all powers granted to personal representatives under the laws of the State of ______________________, including without limitation the power to sell, lease, or otherwise dispose of real or personal property; to retain, invest, and reinvest estate assets; to distribute property in cash or in kind, or partly in each, and to value property for purposes of distribution; to settle claims; and to employ attorneys, accountants, and other professionals.</w:t>
+        <w:t xml:space="preserve">My Personal Representative shall have all powers granted to personal representatives under the laws of the State of Wisconsin, including without limitation the power to sell, lease, or otherwise dispose of real or personal property; to retain, invest, and reinvest estate assets; to distribute property in cash or in kind, or partly in each, and to value property for purposes of distribution; to settle claims; and to employ attorneys, accountants, and other professionals.</w:t>
       </w:r>
     </w:p>
     <w:p>
@@ -1847,7 +1901,7 @@
           <w:sz w:val="24"/>
           <w:szCs w:val="24"/>
         </w:rPr>
-        <w:t xml:space="preserve">This Will shall be construed and administered in accordance with the laws of the State of ______________________.</w:t>
+        <w:t xml:space="preserve">This Will shall be construed and administered in accordance with the laws of the State of Wisconsin.</w:t>
       </w:r>
     </w:p>
     <w:p>
@@ -1952,7 +2006,7 @@
           <w:sz w:val="24"/>
           <w:szCs w:val="24"/>
         </w:rPr>
-        <w:t xml:space="preserve">IN WITNESS WHEREOF, I have signed this Will, consisting of ______ pages including this page and the attestation and affidavit pages, on the ______ day of ______________________, 20____, at ______________________, ______________________.</w:t>
+        <w:t xml:space="preserve">IN WITNESS WHEREOF, I have signed this Will, consisting of ______ pages including this page and the attestation and affidavit pages, on the ______ day of ______________________, 20____, at Brookfield, Wisconsin.</w:t>
       </w:r>
     </w:p>
     <w:p>
@@ -2168,7 +2222,7 @@
           <w:sz w:val="24"/>
           <w:szCs w:val="24"/>
         </w:rPr>
-        <w:t xml:space="preserve">STATE OF ______________________</w:t>
+        <w:t xml:space="preserve">STATE OF WISCONSIN</w:t>
       </w:r>
       <w:r>
         <w:rPr>
@@ -2208,7 +2262,7 @@
           <w:sz w:val="24"/>
           <w:szCs w:val="24"/>
         </w:rPr>
-        <w:t xml:space="preserve">COUNTY OF ______________________</w:t>
+        <w:t xml:space="preserve">COUNTY OF WAUKESHA</w:t>
       </w:r>
       <w:r>
         <w:rPr>
@@ -2431,7 +2485,7 @@
           <w:sz w:val="24"/>
           <w:szCs w:val="24"/>
         </w:rPr>
-        <w:t xml:space="preserve">Fill in every blank: your city, county, and state, and the name of your Personal Representative and an alternate. Account numbers are intentionally omitted; the Fidelity Account is identified by institution and ownership, which is sufficient.</w:t>
+        <w:t xml:space="preserve">Confirm the residence (Brookfield, Waukesha County, Wisconsin) and the executor succession (Anthony, then Andrew, then David) are correct. Account numbers are intentionally omitted; the Fidelity Account is identified by institution and ownership, which is sufficient.</w:t>
       </w:r>
     </w:p>
     <w:p>
@@ -2488,7 +2542,7 @@
           <w:sz w:val="24"/>
           <w:szCs w:val="24"/>
         </w:rPr>
-        <w:t xml:space="preserve">Check your state's execution requirements. Most U.S. states require two adult witnesses who are not beneficiaries, and most accept a notarized self-proving affidavit to simplify probate.</w:t>
+        <w:t xml:space="preserve">Wisconsin requires the will to be signed by you in the presence of two witnesses, who then sign within a reasonable time; use witnesses who are not beneficiaries. The self-proving affidavit should be signed before a notary so the witnesses need not testify in probate. Wisconsin is a marital-property state, which can affect what counts as your estate if you later marry; revisit this will if your circumstances change.</w:t>
       </w:r>
     </w:p>
     <w:p>

</xml_diff>

<commit_message>
Update will: identify Fidelity TOD account and note beneficiary-designated accounts
Co-Authored-By: Claude Fable 5.1 <noreply@anthropic.com>
Claude-Session: https://claude.ai/code/session_0167tGaXTeJNKviLoHzSqyQm
</commit_message>
<xml_diff>
--- a/Last_Will_and_Testament_Colin_Tenaglia.docx
+++ b/Last_Will_and_Testament_Colin_Tenaglia.docx
@@ -754,7 +754,7 @@
           <w:sz w:val="24"/>
           <w:szCs w:val="24"/>
         </w:rPr>
-        <w:t xml:space="preserve">” means my individual (non-retirement) brokerage account maintained at Fidelity Investments, including all cash, securities, and other investments held in it, together with any successor or replacement account into which those assets are transferred. I acknowledge that the Fidelity Account currently carries a transfer-on-death (TOD) designation in favor of my brother, David Tenaglia, and that it will therefore pass to him outside of this Will.</w:t>
+        <w:t xml:space="preserve">” means my individual (non-retirement) brokerage account maintained at Fidelity Investments, registered as "Individual - TOD," account number ending in 2135, including all cash, securities, and other investments held in it, together with any successor or replacement account into which those assets are transferred. I acknowledge that the Fidelity Account currently carries a transfer-on-death (TOD) designation in favor of my brother, David Tenaglia, and that it will therefore pass to him outside of this Will.</w:t>
       </w:r>
     </w:p>
     <w:p>
@@ -2485,7 +2485,26 @@
           <w:sz w:val="24"/>
           <w:szCs w:val="24"/>
         </w:rPr>
-        <w:t xml:space="preserve">Confirm the residence (Brookfield, Waukesha County, Wisconsin) and the executor succession (Anthony, then Andrew, then David) are correct. Account numbers are intentionally omitted; the Fidelity Account is identified by institution and ownership, which is sufficient.</w:t>
+        <w:t xml:space="preserve">Confirm the residence (Brookfield, Waukesha County, Wisconsin) and the executor succession (Anthony, then Andrew, then David) are correct. The Fidelity Account is identified by registration type and the last four digits of its number; your attorney may prefer the full number on the signed copy.</w:t>
+      </w:r>
+    </w:p>
+    <w:p>
+      <w:pPr>
+        <w:pStyle w:val="ListParagraph"/>
+        <w:numPr>
+          <w:ilvl w:val="0"/>
+          <w:numId w:val="2"/>
+        </w:numPr>
+        <w:spacing w:after="160" w:line="300"/>
+        <w:jc w:val="both"/>
+      </w:pPr>
+      <w:r>
+        <w:rPr>
+          <w:rFonts w:ascii="Times New Roman" w:cs="Times New Roman" w:eastAsia="Times New Roman" w:hAnsi="Times New Roman"/>
+          <w:sz w:val="24"/>
+          <w:szCs w:val="24"/>
+        </w:rPr>
+        <w:t xml:space="preserve">Your Fidelity retirement accounts (Traditional IRA, Roth IRA, and the two inherited BDA IRAs) and your Health Savings Account pass by beneficiary designation, not under this will. If David is named as beneficiary on any of them, that property counts toward his 50% under Section 3.4. Review those designations so they match your intent. Your Cash Management account has no TOD designation and will pass under this will as part of the Net Estate.</w:t>
       </w:r>
     </w:p>
     <w:p>

</xml_diff>

<commit_message>
Update will: full Fidelity account number and corrected account notes
Co-Authored-By: Claude Fable 5.1 <noreply@anthropic.com>
Claude-Session: https://claude.ai/code/session_0167tGaXTeJNKviLoHzSqyQm
</commit_message>
<xml_diff>
--- a/Last_Will_and_Testament_Colin_Tenaglia.docx
+++ b/Last_Will_and_Testament_Colin_Tenaglia.docx
@@ -754,7 +754,7 @@
           <w:sz w:val="24"/>
           <w:szCs w:val="24"/>
         </w:rPr>
-        <w:t xml:space="preserve">” means my individual (non-retirement) brokerage account maintained at Fidelity Investments, registered as "Individual - TOD," account number ending in 2135, including all cash, securities, and other investments held in it, together with any successor or replacement account into which those assets are transferred. I acknowledge that the Fidelity Account currently carries a transfer-on-death (TOD) designation in favor of my brother, David Tenaglia, and that it will therefore pass to him outside of this Will.</w:t>
+        <w:t xml:space="preserve">” means my individual (non-retirement) brokerage account maintained at Fidelity Investments, registered as "Individual - TOD," account number Z27632135, including all cash, securities, and other investments held in it, together with any successor or replacement account into which those assets are transferred. I acknowledge that the Fidelity Account currently carries a transfer-on-death (TOD) designation in favor of my brother, David Tenaglia, and that it will therefore pass to him outside of this Will.</w:t>
       </w:r>
     </w:p>
     <w:p>
@@ -2485,7 +2485,7 @@
           <w:sz w:val="24"/>
           <w:szCs w:val="24"/>
         </w:rPr>
-        <w:t xml:space="preserve">Confirm the residence (Brookfield, Waukesha County, Wisconsin) and the executor succession (Anthony, then Andrew, then David) are correct. The Fidelity Account is identified by registration type and the last four digits of its number; your attorney may prefer the full number on the signed copy.</w:t>
+        <w:t xml:space="preserve">Confirm the residence (Brookfield, Waukesha County, Wisconsin) and the executor succession (Anthony, then Andrew, then David) are correct. The Fidelity Account (Z27632135) is the only account with a TOD registration.</w:t>
       </w:r>
     </w:p>
     <w:p>
@@ -2504,7 +2504,7 @@
           <w:sz w:val="24"/>
           <w:szCs w:val="24"/>
         </w:rPr>
-        <w:t xml:space="preserve">Your Fidelity retirement accounts (Traditional IRA, Roth IRA, and the two inherited BDA IRAs) and your Health Savings Account pass by beneficiary designation, not under this will. If David is named as beneficiary on any of them, that property counts toward his 50% under Section 3.4. Review those designations so they match your intent. Your Cash Management account has no TOD designation and will pass under this will as part of the Net Estate.</w:t>
+        <w:t xml:space="preserve">Your other Fidelity accounts (Traditional IRA, Roth IRA, the two inherited BDA IRAs, Health Savings Account, and Cash Management) have no TOD registration and no beneficiary named. With no beneficiary on file they generally default to your estate and pass under this will as part of the Net Estate, so they fall inside the 50 / 10 / 10 / 10 / 15 / 5 split. Ask your attorney whether to name beneficiaries on the IRAs and HSA anyway; an estate as the recipient of a retirement account usually means a faster required payout and a larger tax bill for the heirs than naming individuals directly.</w:t>
       </w:r>
     </w:p>
     <w:p>

</xml_diff>